<commit_message>
test(import): phủ luôn trường hợp tiêu đề chương đặt bằng Heading 1 của Word
Thử ngược "sinh ## cho tiêu đề" không làm đỏ ca nào — khoảng trống thật trong
test, không phải test đã đủ. Fixture cũ dùng đoạn văn thường nên mammoth không
bao giờ sinh <h1>, trong khi file Word thật rất hay dùng Heading 1 cho tiêu đề
chương.

Thêm fixture `ban-thao-tieu-de-heading.docx` (có styles.xml và pStyle) để mammoth
thật sự sinh <h1>, kèm hai ca kiểm rằng phẳng hoá vẫn giữ tiêu đề ở dạng chữ
thuần và bộ tách vẫn ra đúng hai chương với ảnh đúng chỗ.

Thử ngược lại lần nữa: giờ đúng hai ca đỏ.

Co-Authored-By: Claude Opus 5 <noreply@anthropic.com>
Claude-Session: https://claude.ai/code/session_01Cv7g5cdKsLabLaVwgiRcrk
</commit_message>
<xml_diff>
--- a/frontend/e2e/fixtures/ban-thao-co-anh.docx
+++ b/frontend/e2e/fixtures/ban-thao-co-anh.docx
@@ -99,4 +99,12 @@
     </w:p>
   </w:body>
 </w:document>
+</file>
+
+<file path=word/styles.xml><?xml version="1.0" encoding="utf-8"?>
+<w:styles xmlns:w="http://schemas.openxmlformats.org/wordprocessingml/2006/main">
+  <w:style w:type="paragraph" w:styleId="Heading1">
+    <w:name w:val="heading 1"/>
+  </w:style>
+</w:styles>
 </file>
</xml_diff>